<commit_message>
Update document templates to use standardized placeholders for data population
Refactors the `docx-placeholder-converter` utility to handle placeholders split across XML runs, introduces a `PlaceholderMapping` interface, and updates the placeholder conversion script to process NDA, Offer Letter, and Heads of Terms templates.

Replit-Commit-Author: Agent
Replit-Commit-Session-Id: 7bf5aeac-9bdf-4497-ad87-f1a2119826a0
Replit-Commit-Checkpoint-Type: full_checkpoint
Replit-Commit-Event-Id: 875edb22-441e-4bcc-ab46-b67ab3ac9ac0
Replit-Commit-Screenshot-Url: https://storage.googleapis.com/screenshot-production-us-central1/6e57f44f-baf8-42e1-87c9-1798c284d2de/7bf5aeac-9bdf-4497-ad87-f1a2119826a0/QIN4j1W
</commit_message>
<xml_diff>
--- a/data/templates/system_nda.docx
+++ b/data/templates/system_nda.docx
@@ -399,7 +399,7 @@
           <w:highlight w:val="yellow"/>
           <w:rtl w:val="0"/>
         </w:rPr>
-        <w:t xml:space="preserve">(YOUR BUSINESS)</w:t>
+        <w:t xml:space="preserve">{{buyerCompanyName}}</w:t>
       </w:r>
       <w:r>
         <w:rPr>
@@ -914,28 +914,7 @@
           <w:szCs w:val="24"/>
           <w:rtl w:val="0"/>
         </w:rPr>
-        <w:t xml:space="preserve">T H I S   A G R E E M E N T  made the </w:t>
-      </w:r>
-      <w:r>
-        <w:rPr>
-          <w:rFonts w:ascii="Times New Roman" w:cs="Times New Roman" w:eastAsia="Times New Roman" w:hAnsi="Times New Roman"/>
-          <w:b w:val="1"/>
-          <w:sz w:val="24"/>
-          <w:szCs w:val="24"/>
-          <w:highlight w:val="yellow"/>
-          <w:rtl w:val="0"/>
-        </w:rPr>
-        <w:t xml:space="preserve">(DATE)</w:t>
-      </w:r>
-      <w:r>
-        <w:rPr>
-          <w:rFonts w:ascii="Times New Roman" w:cs="Times New Roman" w:eastAsia="Times New Roman" w:hAnsi="Times New Roman"/>
-          <w:b w:val="1"/>
-          <w:sz w:val="24"/>
-          <w:szCs w:val="24"/>
-          <w:rtl w:val="0"/>
-        </w:rPr>
-        <w:t xml:space="preserve"> BETWEEN </w:t>
+        <w:t xml:space="preserve">T H I S   A G R E E M E N T  made the {{currentDate}} BETWEEN </w:t>
       </w:r>
     </w:p>
     <w:p>
@@ -1014,85 +993,48 @@
           <w:szCs w:val="24"/>
           <w:rtl w:val="0"/>
         </w:rPr>
-        <w:t xml:space="preserve">W H E R E A S</w:t>
-      </w:r>
-      <w:r>
-        <w:rPr>
-          <w:rFonts w:ascii="Times New Roman" w:cs="Times New Roman" w:eastAsia="Times New Roman" w:hAnsi="Times New Roman"/>
-          <w:sz w:val="24"/>
-          <w:szCs w:val="24"/>
-          <w:rtl w:val="0"/>
-        </w:rPr>
-        <w:t xml:space="preserve">  it would be desirable for the parties to this Agreement to explore areas of mutual interest relating to an investment or acquisition of </w:t>
-      </w:r>
-      <w:r>
-        <w:rPr>
-          <w:rFonts w:ascii="Times New Roman" w:cs="Times New Roman" w:eastAsia="Times New Roman" w:hAnsi="Times New Roman"/>
-          <w:sz w:val="24"/>
-          <w:szCs w:val="24"/>
-          <w:highlight w:val="yellow"/>
-          <w:rtl w:val="0"/>
-        </w:rPr>
-        <w:t xml:space="preserve">(SELLER’S BUSINESS NAME)</w:t>
-      </w:r>
-      <w:r>
-        <w:rPr>
-          <w:rFonts w:ascii="Times New Roman" w:cs="Times New Roman" w:eastAsia="Times New Roman" w:hAnsi="Times New Roman"/>
-          <w:sz w:val="24"/>
-          <w:szCs w:val="24"/>
-          <w:rtl w:val="0"/>
-        </w:rPr>
-        <w:t xml:space="preserve">, to discuss the establishment of a business relationship (“the Permitted Purpose”)</w:t>
-      </w:r>
-    </w:p>
-    <w:p>
-      <w:pPr>
-        <w:tabs>
-          <w:tab w:val="left" w:pos="-720"/>
-        </w:tabs>
-        <w:spacing w:line="360" w:lineRule="auto"/>
-        <w:rPr>
-          <w:rFonts w:ascii="Times New Roman" w:cs="Times New Roman" w:eastAsia="Times New Roman" w:hAnsi="Times New Roman"/>
-          <w:sz w:val="24"/>
-          <w:szCs w:val="24"/>
-        </w:rPr>
-      </w:pPr>
-      <w:r>
-        <w:rPr>
-          <w:rtl w:val="0"/>
-        </w:rPr>
-      </w:r>
-    </w:p>
-    <w:p>
-      <w:pPr>
-        <w:tabs>
-          <w:tab w:val="left" w:pos="-720"/>
-        </w:tabs>
-        <w:spacing w:line="360" w:lineRule="auto"/>
-        <w:rPr>
-          <w:rFonts w:ascii="Times New Roman" w:cs="Times New Roman" w:eastAsia="Times New Roman" w:hAnsi="Times New Roman"/>
-          <w:sz w:val="24"/>
-          <w:szCs w:val="24"/>
-        </w:rPr>
-      </w:pPr>
-      <w:r>
-        <w:rPr>
-          <w:rFonts w:ascii="Times New Roman" w:cs="Times New Roman" w:eastAsia="Times New Roman" w:hAnsi="Times New Roman"/>
-          <w:b w:val="1"/>
-          <w:sz w:val="24"/>
-          <w:szCs w:val="24"/>
-          <w:rtl w:val="0"/>
-        </w:rPr>
-        <w:t xml:space="preserve">N O W   I T    I S   H E R E B Y   A G R E E D  </w:t>
-      </w:r>
-      <w:r>
-        <w:rPr>
-          <w:rFonts w:ascii="Times New Roman" w:cs="Times New Roman" w:eastAsia="Times New Roman" w:hAnsi="Times New Roman"/>
-          <w:sz w:val="24"/>
-          <w:szCs w:val="24"/>
-          <w:rtl w:val="0"/>
-        </w:rPr>
-        <w:t xml:space="preserve">as follows:</w:t>
+        <w:t xml:space="preserve">W H E R E A S  it would be desirable for the parties to this Agreement to explore areas of mutual interest relating to an investment or acquisition of (SELLER’S BUSINESS NAME), to discuss the establishment of a business relationship (“the Permitted Purpose”)</w:t>
+      </w:r>
+    </w:p>
+    <w:p>
+      <w:pPr>
+        <w:tabs>
+          <w:tab w:val="left" w:pos="-720"/>
+        </w:tabs>
+        <w:spacing w:line="360" w:lineRule="auto"/>
+        <w:rPr>
+          <w:rFonts w:ascii="Times New Roman" w:cs="Times New Roman" w:eastAsia="Times New Roman" w:hAnsi="Times New Roman"/>
+          <w:sz w:val="24"/>
+          <w:szCs w:val="24"/>
+        </w:rPr>
+      </w:pPr>
+      <w:r>
+        <w:rPr>
+          <w:rtl w:val="0"/>
+        </w:rPr>
+      </w:r>
+    </w:p>
+    <w:p>
+      <w:pPr>
+        <w:tabs>
+          <w:tab w:val="left" w:pos="-720"/>
+        </w:tabs>
+        <w:spacing w:line="360" w:lineRule="auto"/>
+        <w:rPr>
+          <w:rFonts w:ascii="Times New Roman" w:cs="Times New Roman" w:eastAsia="Times New Roman" w:hAnsi="Times New Roman"/>
+          <w:sz w:val="24"/>
+          <w:szCs w:val="24"/>
+        </w:rPr>
+      </w:pPr>
+      <w:r>
+        <w:rPr>
+          <w:rFonts w:ascii="Times New Roman" w:cs="Times New Roman" w:eastAsia="Times New Roman" w:hAnsi="Times New Roman"/>
+          <w:b w:val="1"/>
+          <w:sz w:val="24"/>
+          <w:szCs w:val="24"/>
+          <w:rtl w:val="0"/>
+        </w:rPr>
+        <w:t xml:space="preserve">N O W   I T    I S   H E R E B Y   A G R E E D  as follows:</w:t>
       </w:r>
     </w:p>
     <w:p>
@@ -2104,26 +2046,7 @@
           <w:szCs w:val="24"/>
           <w:rtl w:val="0"/>
         </w:rPr>
-        <w:t xml:space="preserve">The Recipient may disclose such Confidential Information as is necessary pursuant to a legal or regulatory requirement provided that it notifies the disclosing Company of the requirement and relevant Confidential Information as soon as the Recipient is aware of the same and in sufficient time to allow the disclosing Company to take such measures as may be available to limit the disclosure and preserve the confidentiality of such Confidential Information nevertheless required to be disclosed and further provided that</w:t>
-      </w:r>
-      <w:r>
-        <w:rPr>
-          <w:rFonts w:ascii="Times New Roman" w:cs="Times New Roman" w:eastAsia="Times New Roman" w:hAnsi="Times New Roman"/>
-          <w:b w:val="1"/>
-          <w:sz w:val="24"/>
-          <w:szCs w:val="24"/>
-          <w:rtl w:val="0"/>
-        </w:rPr>
-        <w:t xml:space="preserve"> </w:t>
-      </w:r>
-      <w:r>
-        <w:rPr>
-          <w:rFonts w:ascii="Times New Roman" w:cs="Times New Roman" w:eastAsia="Times New Roman" w:hAnsi="Times New Roman"/>
-          <w:sz w:val="24"/>
-          <w:szCs w:val="24"/>
-          <w:rtl w:val="0"/>
-        </w:rPr>
-        <w:t xml:space="preserve">the Recipient gives all reasonable assistance required by the disclosing Company in this respect. </w:t>
+        <w:t xml:space="preserve">The Recipient may disclose such Confidential Information as is necessary pursuant to a legal or regulatory requirement provided that it notifies the disclosing Company of the requirement and relevant Confidential Information as soon as the Recipient is aware of the same and in sufficient time to allow the disclosing Company to take such measures as may be available to limit the disclosure and preserve the confidentiality of such Confidential Information nevertheless required to be disclosed and further provided that the Recipient gives all reasonable assistance required by the disclosing Company in this respect. </w:t>
       </w:r>
     </w:p>
     <w:p>
@@ -2633,15 +2556,6 @@
       <w:r>
         <w:rPr>
           <w:rFonts w:ascii="Times New Roman" w:cs="Times New Roman" w:eastAsia="Times New Roman" w:hAnsi="Times New Roman"/>
-          <w:sz w:val="24"/>
-          <w:szCs w:val="24"/>
-          <w:rtl w:val="0"/>
-        </w:rPr>
-        <w:tab/>
-      </w:r>
-      <w:r>
-        <w:rPr>
-          <w:rFonts w:ascii="Times New Roman" w:cs="Times New Roman" w:eastAsia="Times New Roman" w:hAnsi="Times New Roman"/>
           <w:b w:val="1"/>
           <w:sz w:val="24"/>
           <w:szCs w:val="24"/>
@@ -2649,45 +2563,7 @@
           <w:u w:val="single"/>
           <w:rtl w:val="0"/>
         </w:rPr>
-        <w:t xml:space="preserve">(YOUR BUSINESS)</w:t>
-      </w:r>
-      <w:r>
-        <w:rPr>
-          <w:rFonts w:ascii="Times New Roman" w:cs="Times New Roman" w:eastAsia="Times New Roman" w:hAnsi="Times New Roman"/>
-          <w:sz w:val="24"/>
-          <w:szCs w:val="24"/>
-          <w:highlight w:val="yellow"/>
-          <w:rtl w:val="0"/>
-        </w:rPr>
-        <w:t xml:space="preserve"> </w:t>
-      </w:r>
-      <w:r>
-        <w:rPr>
-          <w:rFonts w:ascii="Times New Roman" w:cs="Times New Roman" w:eastAsia="Times New Roman" w:hAnsi="Times New Roman"/>
-          <w:sz w:val="24"/>
-          <w:szCs w:val="24"/>
-          <w:rtl w:val="0"/>
-        </w:rPr>
-        <w:t xml:space="preserve">warrants that they have no existing relationships with, or are investigating making any investments in any business producing or marketing </w:t>
-      </w:r>
-      <w:r>
-        <w:rPr>
-          <w:rFonts w:ascii="Times New Roman" w:cs="Times New Roman" w:eastAsia="Times New Roman" w:hAnsi="Times New Roman"/>
-          <w:sz w:val="24"/>
-          <w:szCs w:val="24"/>
-          <w:highlight w:val="yellow"/>
-          <w:rtl w:val="0"/>
-        </w:rPr>
-        <w:t xml:space="preserve">(PRODUCT/SERVICE)</w:t>
-      </w:r>
-      <w:r>
-        <w:rPr>
-          <w:rFonts w:ascii="Times New Roman" w:cs="Times New Roman" w:eastAsia="Times New Roman" w:hAnsi="Times New Roman"/>
-          <w:sz w:val="24"/>
-          <w:szCs w:val="24"/>
-          <w:rtl w:val="0"/>
-        </w:rPr>
-        <w:t xml:space="preserve"> based products for any purpose.  </w:t>
+        <w:t xml:space="preserve">{{buyerCompanyName}} warrants that they have no existing relationships with, or are investigating making any investments in any business producing or marketing {{productOrService}} based products for any purpose.  </w:t>
       </w:r>
       <w:r>
         <w:rPr>
@@ -2738,26 +2614,7 @@
           <w:szCs w:val="24"/>
           <w:rtl w:val="0"/>
         </w:rPr>
-        <w:t xml:space="preserve">9.</w:t>
-      </w:r>
-      <w:r>
-        <w:rPr>
-          <w:rFonts w:ascii="Times New Roman" w:cs="Times New Roman" w:eastAsia="Times New Roman" w:hAnsi="Times New Roman"/>
-          <w:sz w:val="24"/>
-          <w:szCs w:val="24"/>
-          <w:rtl w:val="0"/>
-        </w:rPr>
-        <w:tab/>
-      </w:r>
-      <w:r>
-        <w:rPr>
-          <w:rFonts w:ascii="Times New Roman" w:cs="Times New Roman" w:eastAsia="Times New Roman" w:hAnsi="Times New Roman"/>
-          <w:b w:val="1"/>
-          <w:sz w:val="24"/>
-          <w:szCs w:val="24"/>
-          <w:rtl w:val="0"/>
-        </w:rPr>
-        <w:t xml:space="preserve">GENERAL</w:t>
+        <w:t xml:space="preserve">9.GENERAL</w:t>
       </w:r>
     </w:p>
     <w:p>
@@ -3470,16 +3327,7 @@
           <w:szCs w:val="24"/>
           <w:rtl w:val="0"/>
         </w:rPr>
-        <w:t xml:space="preserve">AS WITNESS</w:t>
-      </w:r>
-      <w:r>
-        <w:rPr>
-          <w:rFonts w:ascii="Times New Roman" w:cs="Times New Roman" w:eastAsia="Times New Roman" w:hAnsi="Times New Roman"/>
-          <w:sz w:val="24"/>
-          <w:szCs w:val="24"/>
-          <w:rtl w:val="0"/>
-        </w:rPr>
-        <w:t xml:space="preserve"> the hands of the Parties the day and year first above written</w:t>
+        <w:t xml:space="preserve">AS WITNESS the hands of the Parties the day and year first above written</w:t>
       </w:r>
     </w:p>
     <w:p>
@@ -3571,7 +3419,7 @@
           <w:szCs w:val="24"/>
           <w:rtl w:val="0"/>
         </w:rPr>
-        <w:t xml:space="preserve">(YOUR BUSINESS)</w:t>
+        <w:t xml:space="preserve">{{buyerCompanyName}}</w:t>
       </w:r>
     </w:p>
     <w:p>
@@ -3839,7 +3687,7 @@
           <w:szCs w:val="24"/>
           <w:rtl w:val="0"/>
         </w:rPr>
-        <w:t xml:space="preserve">(COMPANY)</w:t>
+        <w:t xml:space="preserve">{{sellerCompanyName}}</w:t>
       </w:r>
     </w:p>
     <w:p>

</xml_diff>